<commit_message>
Trim the abstract to 249 words and cite the reinforcement-learning review
The abstract was 253 words, over the IEEE Access limit of 250; three
phrasings are tightened with no number or claim changed. hu2019 was listed
in the references but never cited; it now supports the related-work
sentence on reinforcement learning for hybrid-vehicle energy management.

Built with paper/build_paper.py (44 references cited, none uncited) and
rendered with paper/render_check.sh (24 pages).

Co-Authored-By: Claude Opus 5.5 (1M context) <noreply@anthropic.com>
Claude-Session: https://claude.ai/code/session_01CsUBkyZznRNcKAR7xjdtWu
</commit_message>
<xml_diff>
--- a/paper/EV-PIL-mock-paper-IEEE-Access.docx
+++ b/paper/EV-PIL-mock-paper-IEEE-Access.docx
@@ -160,7 +160,7 @@
           <w:i w:val="0"/>
           <w:sz w:val="18"/>
         </w:rPr>
-        <w:t>A learned electric-vehicle energy manager is trained and scored against a simulated vehicle, so a fault in that model can be read as a gain. This paper reports one case and the checks that exposed it. A Soft Actor-Critic policy and a rule-based energy manager ran on an ESP32-S3 microcontroller at 100 Hz in a processor-in-the-loop arrangement, against a longitudinal vehicle model identified from logged trips. In a first campaign the policy used less energy than the rules in 14 of 16 settings, by 8.28% on average, and a repeat campaign reproduced it. The gain came from the model, which capped billed battery power at the policy's ceiling but computed acceleration from the uncapped torque. Repetition reproduced the fault, and trip replays never imposed a binding ceiling, so neither detected it. It was caught when the policy finished 7% below a dynamic-programming reference policy computed beforehand, at equal tracking, and a sweep of fixed ceilings with no controller drove all of US06 on 8.05 Wh/km at 5 kW. After correction and retraining, over 36 runs and 2,282,832 control steps, none late, the policy used less energy in 1 of 16 settings and 0.94% more on average, with worse speed tracking, measured on the target. The 8.28% result is withdrawn. Measured gains came from estimation: a two-state Kalman speed estimator cut the energy lost at ten times the sensor-noise floor from 9.44 to 0.24 Wh/km, and a bias-aware detector caught 120 of 120 injected speed-sensor faults with no false alarm in one clean hour.</w:t>
+        <w:t>A learned electric-vehicle energy manager is trained and scored against a simulated vehicle, so a fault in that model can be read as a gain. This paper reports one case and the checks that exposed it. A Soft Actor-Critic policy and a rule-based energy manager ran on an ESP32-S3 microcontroller at 100 Hz in a processor-in-the-loop arrangement, against a longitudinal vehicle model identified from logged trips. In a first campaign the policy used less energy than the rules in 14 of 16 settings, by 8.28% on average, and a repeat campaign reproduced it. The gain came from the model, which capped billed battery power at the policy's ceiling but computed acceleration from the uncapped torque. Repetition reproduced the fault, and trip replays never imposed a binding ceiling, so neither detected it. It was caught when the policy finished 7% below a dynamic-programming reference computed beforehand, at equal tracking, and a sweep of fixed ceilings with no controller drove US06 on 8.05 Wh/km at 5 kW. After correction and retraining, over 36 runs and 2,282,832 control steps, none late, the policy used less energy in 1 of 16 settings and 0.94% more on average, with worse speed tracking on the target. The 8.28% result is withdrawn. Measured gains came from estimation: a two-state Kalman speed estimator cut the energy lost at ten times the sensor-noise floor from 9.44 to 0.24 Wh/km, and a bias-aware detector caught 120 of 120 injected speed-sensor faults with no false alarm in one clean hour.</w:t>
       </w:r>
     </w:p>
     <w:p>
@@ -560,7 +560,7 @@
           <w:i w:val="0"/>
           <w:sz w:val="20"/>
         </w:rPr>
-        <w:t>Reinforcement learning has been applied to energy management mainly in hybrid vehicles. A deep Q-network strategy for a power-split hybrid bus reached about 89% of the fuel economy of DP on an unseen driving condition [17], a SAC-based strategy for a hybrid tracked vehicle was compared with standard SAC and with DDPG in simulation [18], and a look-ahead strategy for a parallel hybrid combined velocity prediction with reinforcement learning and was checked on a HIL bench against DP [19]. A learned power manager for a battery EV with an ultracapacitor was compared with rules and DP [20]. The reference points are classical. DP [10] gives the optimum for a known cycle, Pontryagin's minimum principle offers an analytical route [21], and the equivalent consumption minimisation strategy (ECMS) turns the problem into an instantaneous cost [22], [23]. Rules are the usual deployable baseline.</w:t>
+        <w:t>Reinforcement learning has been applied to energy management mainly in hybrid vehicles [17]. A deep Q-network strategy for a power-split hybrid bus reached about 89% of the fuel economy of DP on an unseen driving condition [18], a SAC-based strategy for a hybrid tracked vehicle was compared with standard SAC and with DDPG in simulation [19], and a look-ahead strategy for a parallel hybrid combined velocity prediction with reinforcement learning and was checked on a HIL bench against DP [20]. A learned power manager for a battery EV with an ultracapacitor was compared with rules and DP [21]. The reference points are classical. DP [10] gives the optimum for a known cycle, Pontryagin's minimum principle offers an analytical route [22], and the equivalent consumption minimisation strategy (ECMS) turns the problem into an instantaneous cost [23], [24]. Rules are the usual deployable baseline.</w:t>
       </w:r>
     </w:p>
     <w:p>
@@ -592,7 +592,7 @@
           <w:i w:val="0"/>
           <w:sz w:val="20"/>
         </w:rPr>
-        <w:t>Evaluation practice matters as much as the method. Deep reinforcement learning results differ across seeds and implementation choices [2], and point estimates over a few runs hide uncertainty that intervals and rank statistics would show [24]. Paired differences with intervals and a rank test are reported here for that reason.</w:t>
+        <w:t>Evaluation practice matters as much as the method. Deep reinforcement learning results differ across seeds and implementation choices [2], and point estimates over a few runs hide uncertainty that intervals and rank statistics would show [25]. Paired differences with intervals and a rank test are reported here for that reason.</w:t>
       </w:r>
     </w:p>
     <w:p>
@@ -623,7 +623,7 @@
           <w:i w:val="0"/>
           <w:sz w:val="20"/>
         </w:rPr>
-        <w:t>When speed is free, the problem changes. Sciarretta et al. [25] cast energy-efficient driving as an optimal control problem and survey its solutions, and deep reinforcement learning has been applied to eco-driving in urban scenarios [26]. The DP planner of Section VIII belongs to the classical family. It shows where headroom reappears and is not offered as a new planner.</w:t>
+        <w:t>When speed is free, the problem changes. Sciarretta et al. [26] cast energy-efficient driving as an optimal control problem and survey its solutions, and deep reinforcement learning has been applied to eco-driving in urban scenarios [27]. The DP planner of Section VIII belongs to the classical family. It shows where headroom reappears and is not offered as a new planner.</w:t>
       </w:r>
     </w:p>
     <w:p>
@@ -654,7 +654,7 @@
           <w:i w:val="0"/>
           <w:sz w:val="20"/>
         </w:rPr>
-        <w:t>A learner optimises the simulator it is given, not the vehicle it stands for. Amodei et al. [1] list reward hacking among the concrete problems of learned systems, including exploits of how a reward is implemented, Skalse et al. [27] define it formally as optimisation of an imperfect proxy that lowers the true objective, and Lehman et al. [28] collected cases in which evolutionary search exposed bugs in simulations and exploited them. Sim-to-real work addresses a neighbouring gap, between simulator and physical system, by randomising simulator parameters [29] and related methods [30]. The artefact here is a plain instance of the first kind: a billing rule that did not act on motion. Section IX lists checks that would have exposed it.</w:t>
+        <w:t>A learner optimises the simulator it is given, not the vehicle it stands for. Amodei et al. [1] list reward hacking among the concrete problems of learned systems, including exploits of how a reward is implemented, Skalse et al. [28] define it formally as optimisation of an imperfect proxy that lowers the true objective, and Lehman et al. [29] collected cases in which evolutionary search exposed bugs in simulations and exploited them. Sim-to-real work addresses a neighbouring gap, between simulator and physical system, by randomising simulator parameters [30] and related methods [31]. The artefact here is a plain instance of the first kind: a billing rule that did not act on motion. Section IX lists checks that would have exposed it.</w:t>
       </w:r>
     </w:p>
     <w:p>
@@ -685,7 +685,7 @@
           <w:i w:val="0"/>
           <w:sz w:val="20"/>
         </w:rPr>
-        <w:t>Vehicle controllers are validated through a staged path of model-, software-, hardware-in-the-loop and vehicle tests [31]. HIL benches drive a real controller or real energy storage from a simulated vehicle, as in the validation of a learned power manager on an xPC Target platform [20]. PIL is an earlier step. Inference frameworks for microcontrollers [32] and joint model and library design [33] show that small devices can run networks, and integer quantisation [34] and distillation [35] shrink them. Dulac-Arnold et al. [3] list the constraints that separate laboratory reinforcement learning from deployment, among them real-time inference; what the cited works do not give, in the vehicle-energy setting, is a measured loop with a stated deadline on the target together with a rule baseline run through the same loop. This work supplies one.</w:t>
+        <w:t>Vehicle controllers are validated through a staged path of model-, software-, hardware-in-the-loop and vehicle tests [32]. HIL benches drive a real controller or real energy storage from a simulated vehicle, as in the validation of a learned power manager on an xPC Target platform [21]. PIL is an earlier step. Inference frameworks for microcontrollers [33] and joint model and library design [34] show that small devices can run networks, and integer quantisation [35] and distillation [36] shrink them. Dulac-Arnold et al. [3] list the constraints that separate laboratory reinforcement learning from deployment, among them real-time inference; what the cited works do not give, in the vehicle-energy setting, is a measured loop with a stated deadline on the target together with a rule baseline run through the same loop. This work supplies one.</w:t>
       </w:r>
     </w:p>
     <w:p>
@@ -716,7 +716,7 @@
           <w:i w:val="0"/>
           <w:sz w:val="20"/>
         </w:rPr>
-        <w:t>Kalman filtering [11] is a standard tool for state estimation, including vehicle speed; a recent example fuses inertial, steering-angle and wheel-speed sensors [36]. Model-based fault detection compares measured signals with model predictions and examines the residual [37], and learned detectors are the alternative: LSTM networks for time-series anomalies [38], a general survey [39], and the small recurrent models gated recurrent unit (GRU) [40] and FastGRNN [41]. Here, a classical estimator and a model-based detector are set against learned reviewers, each run in the vehicle loop as well as scored on labelled faults.</w:t>
+        <w:t>Kalman filtering [11] is a standard tool for state estimation, including vehicle speed; a recent example fuses inertial, steering-angle and wheel-speed sensors [37]. Model-based fault detection compares measured signals with model predictions and examines the residual [38], and learned detectors are the alternative: LSTM networks for time-series anomalies [39], a general survey [40], and the small recurrent models gated recurrent unit (GRU) [41] and FastGRNN [42]. Here, a classical estimator and a model-based detector are set against learned reviewers, each run in the vehicle loop as well as scored on labelled faults.</w:t>
       </w:r>
     </w:p>
     <w:p>
@@ -1340,7 +1340,7 @@
                 <w:i w:val="0"/>
                 <w:sz w:val="15"/>
               </w:rPr>
-              <w:t>Wu et al. [17]</w:t>
+              <w:t>Wu et al. [18]</w:t>
             </w:r>
           </w:p>
         </w:tc>
@@ -1468,7 +1468,7 @@
                 <w:i w:val="0"/>
                 <w:sz w:val="15"/>
               </w:rPr>
-              <w:t>Sun et al. [18]</w:t>
+              <w:t>Sun et al. [19]</w:t>
             </w:r>
           </w:p>
         </w:tc>
@@ -1596,7 +1596,7 @@
                 <w:i w:val="0"/>
                 <w:sz w:val="15"/>
               </w:rPr>
-              <w:t>Xiong et al. [20]</w:t>
+              <w:t>Xiong et al. [21]</w:t>
             </w:r>
           </w:p>
         </w:tc>
@@ -8238,7 +8238,7 @@
           <w:i w:val="0"/>
           <w:sz w:val="20"/>
         </w:rPr>
-        <w:t xml:space="preserve">The three identified chassis coefficients do not measure what they are named after. The fitted rolling coefficient of 0.01947 is 2.2 times the 0.00878 of a published coastdown test of a 2013 Nissan Leaf [42]. That is unlikely to be tyre rolling resistance alone; the value probably absorbs drivetrain and brake drag, efficiency-map error and unmodelled load, and the same holds for </w:t>
+        <w:t xml:space="preserve">The three identified chassis coefficients do not measure what they are named after. The fitted rolling coefficient of 0.01947 is 2.2 times the 0.00878 of a published coastdown test of a 2013 Nissan Leaf [43]. That is unlikely to be tyre rolling resistance alone; the value probably absorbs drivetrain and brake drag, efficiency-map error and unmodelled load, and the same holds for </w:t>
       </w:r>
       <w:r>
         <w:rPr>
@@ -14187,7 +14187,7 @@
           <w:i w:val="0"/>
           <w:sz w:val="20"/>
         </w:rPr>
-        <w:t>The ladder runs, in order of cost, from persistence to linear regression, gradient-boosted trees (XGBoost) [15], a one-layer long short-term memory network (LSTM) [43] and a two-layer Transformer encoder [12]. Table 9 and Fig. 8 give the result. Each neural model is scored at its best validation epoch, so its error is slightly optimistic.</w:t>
+        <w:t>The ladder runs, in order of cost, from persistence to linear regression, gradient-boosted trees (XGBoost) [15], a one-layer long short-term memory network (LSTM) [44] and a two-layer Transformer encoder [12]. Table 9 and Fig. 8 give the result. Each neural model is scored at its best validation epoch, so its error is slightly optimistic.</w:t>
       </w:r>
     </w:p>
     <w:tbl>
@@ -15177,7 +15177,7 @@
           <w:i w:val="0"/>
           <w:sz w:val="20"/>
         </w:rPr>
-        <w:t>Rounding weights and activations to 8 bits [34] raised the error of the final-epoch model from 11.051 kW to 11.156 kW, a loss of 0.95%, and shrank the stored model 3.6 times, from 71.7 KB to 20.2 KB (simulated). The timed graph needs 28,894 bytes, 9.4% of the memory budget. Gate G5 is not closed in full. The converted model has not been run through an embedded runtime on the target, so the 8-bit accuracy is a host figure only.</w:t>
+        <w:t>Rounding weights and activations to 8 bits [35] raised the error of the final-epoch model from 11.051 kW to 11.156 kW, a loss of 0.95%, and shrank the stored model 3.6 times, from 71.7 KB to 20.2 KB (simulated). The timed graph needs 28,894 bytes, 9.4% of the memory budget. Gate G5 is not closed in full. The converted model has not been run through an embedded runtime on the target, so the 8-bit accuracy is a host figure only.</w:t>
       </w:r>
     </w:p>
     <w:p>
@@ -15193,7 +15193,7 @@
           <w:i w:val="0"/>
           <w:sz w:val="20"/>
         </w:rPr>
-        <w:t>Two further studies, both run on the host, added nothing to accuracy. A physics-informed loss [16] left the error unchanged, 11.057 kW against 11.052 kW, though it cut the share of steps where power disagrees with voltage times current by more than 500 W from 24.5% to 2.5%; consistency improved and accuracy did not. Distillation from a larger teacher [35] did not help. The students were worse by 0.20% and 0.89%, and the sign changed between seeds.</w:t>
+        <w:t>Two further studies, both run on the host, added nothing to accuracy. A physics-informed loss [16] left the error unchanged, 11.057 kW against 11.052 kW, though it cut the share of steps where power disagrees with voltage times current by more than 500 W from 24.5% to 2.5%; consistency improved and accuracy did not. Distillation from a larger teacher [36] did not help. The students were worse by 0.20% and 0.89%, and the sign changed between seeds.</w:t>
       </w:r>
     </w:p>
     <w:p>
@@ -17804,7 +17804,7 @@
           <w:i w:val="0"/>
           <w:sz w:val="20"/>
         </w:rPr>
-        <w:t>A slower supervisory slot sits around the detector. Every 100 ms it receives twelve summary numbers and may hold a flag, release it, switch the fallback speed, or tighten the tests. It never commands torque. A hand-written rule monitor, a gated recurrent unit (GRU) [40] of 1,508 parameters and a FastGRNN [41] of 550 each filled the slot. Both have 16 hidden states, ran on the host only (simulated), and were not timed on the target.</w:t>
+        <w:t>A slower supervisory slot sits around the detector. Every 100 ms it receives twelve summary numbers and may hold a flag, release it, switch the fallback speed, or tighten the tests. It never commands torque. A hand-written rule monitor, a gated recurrent unit (GRU) [41] of 1,508 parameters and a FastGRNN [42] of 550 each filled the slot. Both have 16 hidden states, ran on the host only (simulated), and were not timed on the target.</w:t>
       </w:r>
     </w:p>
     <w:p>
@@ -17965,7 +17965,7 @@
           <w:i w:val="0"/>
           <w:sz w:val="20"/>
         </w:rPr>
-        <w:t>Everything in this section is simulated on the host computer; nothing ran on the target. The energy managers of Section V could not change the speed trace, and that fixed trace is what left them almost nothing to win. Here the vehicle chooses the trace, so the headroom can be measured where it appears. Eco-driving is a long-standing optimal-control problem [25].</w:t>
+        <w:t>Everything in this section is simulated on the host computer; nothing ran on the target. The energy managers of Section V could not change the speed trace, and that fixed trace is what left them almost nothing to win. Here the vehicle chooses the trace, so the headroom can be measured where it appears. Eco-driving is a long-standing optimal-control problem [26].</w:t>
       </w:r>
     </w:p>
     <w:p>
@@ -19722,7 +19722,7 @@
           <w:i w:val="0"/>
           <w:sz w:val="16"/>
         </w:rPr>
-        <w:t xml:space="preserve">J. Wu, H. He, J. Peng, Y. Li, and Z. Li, “Continuous reinforcement learning of energy management with deep Q network for a power split hybrid electric bus,” </w:t>
+        <w:t xml:space="preserve">X. Hu, T. Liu, X. Qi, and M. Barth, “Reinforcement learning for hybrid and plug-in hybrid electric vehicle energy management: Recent advances and prospects,” </w:t>
       </w:r>
       <w:r>
         <w:rPr>
@@ -19731,7 +19731,7 @@
           <w:i/>
           <w:sz w:val="16"/>
         </w:rPr>
-        <w:t>Applied Energy</w:t>
+        <w:t>IEEE Industrial Electronics Magazine</w:t>
       </w:r>
       <w:r>
         <w:rPr>
@@ -19740,7 +19740,7 @@
           <w:i w:val="0"/>
           <w:sz w:val="16"/>
         </w:rPr>
-        <w:t>, vol. 222, pp. 799–811, July 2018, doi: 10.1016/j.apenergy.2018.03.104.</w:t>
+        <w:t>, vol. 13, no. 3, pp. 16–25, September 2019, doi: 10.1109/MIE.2019.2913015.</w:t>
       </w:r>
     </w:p>
     <w:p>
@@ -19769,7 +19769,7 @@
           <w:i w:val="0"/>
           <w:sz w:val="16"/>
         </w:rPr>
-        <w:t xml:space="preserve">W. Sun, Y. Zou, X. Zhang, N. Guo, B. Zhang, and G. Du, “High robustness energy management strategy of hybrid electric vehicle based on improved soft actor-critic deep reinforcement learning,” </w:t>
+        <w:t xml:space="preserve">J. Wu, H. He, J. Peng, Y. Li, and Z. Li, “Continuous reinforcement learning of energy management with deep Q network for a power split hybrid electric bus,” </w:t>
       </w:r>
       <w:r>
         <w:rPr>
@@ -19778,7 +19778,7 @@
           <w:i/>
           <w:sz w:val="16"/>
         </w:rPr>
-        <w:t>Energy</w:t>
+        <w:t>Applied Energy</w:t>
       </w:r>
       <w:r>
         <w:rPr>
@@ -19787,7 +19787,7 @@
           <w:i w:val="0"/>
           <w:sz w:val="16"/>
         </w:rPr>
-        <w:t>, vol. 258, pp. 124806, November 2022, doi: 10.1016/j.energy.2022.124806.</w:t>
+        <w:t>, vol. 222, pp. 799–811, July 2018, doi: 10.1016/j.apenergy.2018.03.104.</w:t>
       </w:r>
     </w:p>
     <w:p>
@@ -19816,7 +19816,7 @@
           <w:i w:val="0"/>
           <w:sz w:val="16"/>
         </w:rPr>
-        <w:t xml:space="preserve">T. Liu, X. Hu, S. E. Li, and D. Cao, “Reinforcement learning optimized look-ahead energy management of a parallel hybrid electric vehicle,” </w:t>
+        <w:t xml:space="preserve">W. Sun, Y. Zou, X. Zhang, N. Guo, B. Zhang, and G. Du, “High robustness energy management strategy of hybrid electric vehicle based on improved soft actor-critic deep reinforcement learning,” </w:t>
       </w:r>
       <w:r>
         <w:rPr>
@@ -19825,7 +19825,7 @@
           <w:i/>
           <w:sz w:val="16"/>
         </w:rPr>
-        <w:t>IEEE/ASME Transactions on Mechatronics</w:t>
+        <w:t>Energy</w:t>
       </w:r>
       <w:r>
         <w:rPr>
@@ -19834,7 +19834,7 @@
           <w:i w:val="0"/>
           <w:sz w:val="16"/>
         </w:rPr>
-        <w:t>, vol. 22, no. 4, pp. 1497–1507, August 2017, doi: 10.1109/TMECH.2017.2707338.</w:t>
+        <w:t>, vol. 258, pp. 124806, November 2022, doi: 10.1016/j.energy.2022.124806.</w:t>
       </w:r>
     </w:p>
     <w:p>
@@ -19863,7 +19863,7 @@
           <w:i w:val="0"/>
           <w:sz w:val="16"/>
         </w:rPr>
-        <w:t xml:space="preserve">R. Xiong, Y. Duan, J. Cao, and Q. Yu, “Battery and ultracapacitor in-the-loop approach to validate a real-time power management method for an all-climate electric vehicle,” </w:t>
+        <w:t xml:space="preserve">T. Liu, X. Hu, S. E. Li, and D. Cao, “Reinforcement learning optimized look-ahead energy management of a parallel hybrid electric vehicle,” </w:t>
       </w:r>
       <w:r>
         <w:rPr>
@@ -19872,7 +19872,7 @@
           <w:i/>
           <w:sz w:val="16"/>
         </w:rPr>
-        <w:t>Applied Energy</w:t>
+        <w:t>IEEE/ASME Transactions on Mechatronics</w:t>
       </w:r>
       <w:r>
         <w:rPr>
@@ -19881,7 +19881,7 @@
           <w:i w:val="0"/>
           <w:sz w:val="16"/>
         </w:rPr>
-        <w:t>, vol. 217, pp. 153–165, May 2018, doi: 10.1016/j.apenergy.2018.02.128.</w:t>
+        <w:t>, vol. 22, no. 4, pp. 1497–1507, August 2017, doi: 10.1109/TMECH.2017.2707338.</w:t>
       </w:r>
     </w:p>
     <w:p>
@@ -19910,7 +19910,7 @@
           <w:i w:val="0"/>
           <w:sz w:val="16"/>
         </w:rPr>
-        <w:t xml:space="preserve">N. Kim, S. Cha, and H. Peng, “Optimal control of hybrid electric vehicles based on Pontryagin's minimum principle,” </w:t>
+        <w:t xml:space="preserve">R. Xiong, Y. Duan, J. Cao, and Q. Yu, “Battery and ultracapacitor in-the-loop approach to validate a real-time power management method for an all-climate electric vehicle,” </w:t>
       </w:r>
       <w:r>
         <w:rPr>
@@ -19919,7 +19919,7 @@
           <w:i/>
           <w:sz w:val="16"/>
         </w:rPr>
-        <w:t>IEEE Transactions on Control Systems Technology</w:t>
+        <w:t>Applied Energy</w:t>
       </w:r>
       <w:r>
         <w:rPr>
@@ -19928,7 +19928,7 @@
           <w:i w:val="0"/>
           <w:sz w:val="16"/>
         </w:rPr>
-        <w:t>, vol. 19, no. 5, pp. 1279–1287, September 2011, doi: 10.1109/TCST.2010.2061232.</w:t>
+        <w:t>, vol. 217, pp. 153–165, May 2018, doi: 10.1016/j.apenergy.2018.02.128.</w:t>
       </w:r>
     </w:p>
     <w:p>
@@ -19957,7 +19957,7 @@
           <w:i w:val="0"/>
           <w:sz w:val="16"/>
         </w:rPr>
-        <w:t xml:space="preserve">G. Paganelli, S. Delprat, T. M. Guerra, J. Rimaux, and J. J. Santin, “Equivalent consumption minimization strategy for parallel hybrid powertrains,” </w:t>
+        <w:t xml:space="preserve">N. Kim, S. Cha, and H. Peng, “Optimal control of hybrid electric vehicles based on Pontryagin's minimum principle,” </w:t>
       </w:r>
       <w:r>
         <w:rPr>
@@ -19966,7 +19966,7 @@
           <w:i/>
           <w:sz w:val="16"/>
         </w:rPr>
-        <w:t>Proceedings of the IEEE 55th Vehicular Technology Conference (VTC Spring 2002)</w:t>
+        <w:t>IEEE Transactions on Control Systems Technology</w:t>
       </w:r>
       <w:r>
         <w:rPr>
@@ -19975,7 +19975,7 @@
           <w:i w:val="0"/>
           <w:sz w:val="16"/>
         </w:rPr>
-        <w:t>, vol. 4, pp. 2076–2081, 2002, doi: 10.1109/VTC.2002.1002989.</w:t>
+        <w:t>, vol. 19, no. 5, pp. 1279–1287, September 2011, doi: 10.1109/TCST.2010.2061232.</w:t>
       </w:r>
     </w:p>
     <w:p>
@@ -20004,7 +20004,7 @@
           <w:i w:val="0"/>
           <w:sz w:val="16"/>
         </w:rPr>
-        <w:t xml:space="preserve">A. Sciarretta, M. Back, and L. Guzzella, “Optimal control of parallel hybrid electric vehicles,” </w:t>
+        <w:t xml:space="preserve">G. Paganelli, S. Delprat, T. M. Guerra, J. Rimaux, and J. J. Santin, “Equivalent consumption minimization strategy for parallel hybrid powertrains,” </w:t>
       </w:r>
       <w:r>
         <w:rPr>
@@ -20013,7 +20013,7 @@
           <w:i/>
           <w:sz w:val="16"/>
         </w:rPr>
-        <w:t>IEEE Transactions on Control Systems Technology</w:t>
+        <w:t>Proceedings of the IEEE 55th Vehicular Technology Conference (VTC Spring 2002)</w:t>
       </w:r>
       <w:r>
         <w:rPr>
@@ -20022,7 +20022,7 @@
           <w:i w:val="0"/>
           <w:sz w:val="16"/>
         </w:rPr>
-        <w:t>, vol. 12, no. 3, pp. 352–363, May 2004, doi: 10.1109/TCST.2004.824312.</w:t>
+        <w:t>, vol. 4, pp. 2076–2081, 2002, doi: 10.1109/VTC.2002.1002989.</w:t>
       </w:r>
     </w:p>
     <w:p>
@@ -20051,7 +20051,7 @@
           <w:i w:val="0"/>
           <w:sz w:val="16"/>
         </w:rPr>
-        <w:t xml:space="preserve">R. Agarwal, M. Schwarzer, P. S. Castro, A. Courville, and M. G. Bellemare, “Deep reinforcement learning at the edge of the statistical precipice,” </w:t>
+        <w:t xml:space="preserve">A. Sciarretta, M. Back, and L. Guzzella, “Optimal control of parallel hybrid electric vehicles,” </w:t>
       </w:r>
       <w:r>
         <w:rPr>
@@ -20060,7 +20060,7 @@
           <w:i/>
           <w:sz w:val="16"/>
         </w:rPr>
-        <w:t>Advances in Neural Information Processing Systems (NeurIPS)</w:t>
+        <w:t>IEEE Transactions on Control Systems Technology</w:t>
       </w:r>
       <w:r>
         <w:rPr>
@@ -20069,7 +20069,7 @@
           <w:i w:val="0"/>
           <w:sz w:val="16"/>
         </w:rPr>
-        <w:t>, vol. 34, December 2021.</w:t>
+        <w:t>, vol. 12, no. 3, pp. 352–363, May 2004, doi: 10.1109/TCST.2004.824312.</w:t>
       </w:r>
     </w:p>
     <w:p>
@@ -20098,7 +20098,7 @@
           <w:i w:val="0"/>
           <w:sz w:val="16"/>
         </w:rPr>
-        <w:t xml:space="preserve">A. Sciarretta, G. De Nunzio, and L. L. Ojeda, “Optimal ecodriving control: Energy-efficient driving of road vehicles as an optimal control problem,” </w:t>
+        <w:t xml:space="preserve">R. Agarwal, M. Schwarzer, P. S. Castro, A. Courville, and M. G. Bellemare, “Deep reinforcement learning at the edge of the statistical precipice,” </w:t>
       </w:r>
       <w:r>
         <w:rPr>
@@ -20107,7 +20107,7 @@
           <w:i/>
           <w:sz w:val="16"/>
         </w:rPr>
-        <w:t>IEEE Control Systems Magazine</w:t>
+        <w:t>Advances in Neural Information Processing Systems (NeurIPS)</w:t>
       </w:r>
       <w:r>
         <w:rPr>
@@ -20116,7 +20116,7 @@
           <w:i w:val="0"/>
           <w:sz w:val="16"/>
         </w:rPr>
-        <w:t>, vol. 35, no. 5, pp. 71–90, October 2015, doi: 10.1109/MCS.2015.2449688.</w:t>
+        <w:t>, vol. 34, December 2021.</w:t>
       </w:r>
     </w:p>
     <w:p>
@@ -20145,7 +20145,7 @@
           <w:i w:val="0"/>
           <w:sz w:val="16"/>
         </w:rPr>
-        <w:t xml:space="preserve">M. Wegener, L. Koch, M. Eisenbarth, and J. Andert, “Automated eco-driving in urban scenarios using deep reinforcement learning,” </w:t>
+        <w:t xml:space="preserve">A. Sciarretta, G. De Nunzio, and L. L. Ojeda, “Optimal ecodriving control: Energy-efficient driving of road vehicles as an optimal control problem,” </w:t>
       </w:r>
       <w:r>
         <w:rPr>
@@ -20154,7 +20154,7 @@
           <w:i/>
           <w:sz w:val="16"/>
         </w:rPr>
-        <w:t>Transportation Research Part C: Emerging Technologies</w:t>
+        <w:t>IEEE Control Systems Magazine</w:t>
       </w:r>
       <w:r>
         <w:rPr>
@@ -20163,7 +20163,7 @@
           <w:i w:val="0"/>
           <w:sz w:val="16"/>
         </w:rPr>
-        <w:t>, vol. 126, pp. 102967, 2021, doi: 10.1016/j.trc.2021.102967.</w:t>
+        <w:t>, vol. 35, no. 5, pp. 71–90, October 2015, doi: 10.1109/MCS.2015.2449688.</w:t>
       </w:r>
     </w:p>
     <w:p>
@@ -20192,7 +20192,7 @@
           <w:i w:val="0"/>
           <w:sz w:val="16"/>
         </w:rPr>
-        <w:t xml:space="preserve">J. Skalse, N. H. R. Howe, D. Krasheninnikov, and D. Krueger, “Defining and characterizing reward gaming,” </w:t>
+        <w:t xml:space="preserve">M. Wegener, L. Koch, M. Eisenbarth, and J. Andert, “Automated eco-driving in urban scenarios using deep reinforcement learning,” </w:t>
       </w:r>
       <w:r>
         <w:rPr>
@@ -20201,7 +20201,7 @@
           <w:i/>
           <w:sz w:val="16"/>
         </w:rPr>
-        <w:t>Advances in Neural Information Processing Systems (NeurIPS)</w:t>
+        <w:t>Transportation Research Part C: Emerging Technologies</w:t>
       </w:r>
       <w:r>
         <w:rPr>
@@ -20210,7 +20210,7 @@
           <w:i w:val="0"/>
           <w:sz w:val="16"/>
         </w:rPr>
-        <w:t>, vol. 35, December 2022.</w:t>
+        <w:t>, vol. 126, pp. 102967, 2021, doi: 10.1016/j.trc.2021.102967.</w:t>
       </w:r>
     </w:p>
     <w:p>
@@ -20239,7 +20239,7 @@
           <w:i w:val="0"/>
           <w:sz w:val="16"/>
         </w:rPr>
-        <w:t xml:space="preserve">J. Lehman, J. Clune, D. Misevic, and et al., “The surprising creativity of digital evolution: A collection of anecdotes from the evolutionary computation and artificial life research communities,” </w:t>
+        <w:t xml:space="preserve">J. Skalse, N. H. R. Howe, D. Krasheninnikov, and D. Krueger, “Defining and characterizing reward gaming,” </w:t>
       </w:r>
       <w:r>
         <w:rPr>
@@ -20248,7 +20248,7 @@
           <w:i/>
           <w:sz w:val="16"/>
         </w:rPr>
-        <w:t>Artificial Life</w:t>
+        <w:t>Advances in Neural Information Processing Systems (NeurIPS)</w:t>
       </w:r>
       <w:r>
         <w:rPr>
@@ -20257,7 +20257,7 @@
           <w:i w:val="0"/>
           <w:sz w:val="16"/>
         </w:rPr>
-        <w:t>, vol. 26, no. 2, pp. 274–306, 2020, doi: 10.1162/artl_a_00319.</w:t>
+        <w:t>, vol. 35, December 2022.</w:t>
       </w:r>
     </w:p>
     <w:p>
@@ -20286,7 +20286,7 @@
           <w:i w:val="0"/>
           <w:sz w:val="16"/>
         </w:rPr>
-        <w:t xml:space="preserve">J. Tobin, R. Fong, A. Ray, J. Schneider, W. Zaremba, and P. Abbeel, “Domain randomization for transferring deep neural networks from simulation to the real world,” </w:t>
+        <w:t xml:space="preserve">J. Lehman, J. Clune, D. Misevic, and et al., “The surprising creativity of digital evolution: A collection of anecdotes from the evolutionary computation and artificial life research communities,” </w:t>
       </w:r>
       <w:r>
         <w:rPr>
@@ -20295,7 +20295,7 @@
           <w:i/>
           <w:sz w:val="16"/>
         </w:rPr>
-        <w:t>Proceedings of the IEEE/RSJ International Conference on Intelligent Robots and Systems (IROS)</w:t>
+        <w:t>Artificial Life</w:t>
       </w:r>
       <w:r>
         <w:rPr>
@@ -20304,7 +20304,7 @@
           <w:i w:val="0"/>
           <w:sz w:val="16"/>
         </w:rPr>
-        <w:t>, September 2017, doi: 10.1109/IROS.2017.8202133.</w:t>
+        <w:t>, vol. 26, no. 2, pp. 274–306, 2020, doi: 10.1162/artl_a_00319.</w:t>
       </w:r>
     </w:p>
     <w:p>
@@ -20333,7 +20333,7 @@
           <w:i w:val="0"/>
           <w:sz w:val="16"/>
         </w:rPr>
-        <w:t xml:space="preserve">W. Zhao, J. P. Queralta, and T. Westerlund, “Sim-to-real transfer in deep reinforcement learning for robotics: a survey,” </w:t>
+        <w:t xml:space="preserve">J. Tobin, R. Fong, A. Ray, J. Schneider, W. Zaremba, and P. Abbeel, “Domain randomization for transferring deep neural networks from simulation to the real world,” </w:t>
       </w:r>
       <w:r>
         <w:rPr>
@@ -20342,7 +20342,7 @@
           <w:i/>
           <w:sz w:val="16"/>
         </w:rPr>
-        <w:t>Proceedings of the IEEE Symposium Series on Computational Intelligence (SSCI)</w:t>
+        <w:t>Proceedings of the IEEE/RSJ International Conference on Intelligent Robots and Systems (IROS)</w:t>
       </w:r>
       <w:r>
         <w:rPr>
@@ -20351,7 +20351,7 @@
           <w:i w:val="0"/>
           <w:sz w:val="16"/>
         </w:rPr>
-        <w:t>, pp. 737–744, December 2020, doi: 10.1109/SSCI47803.2020.9308468.</w:t>
+        <w:t>, September 2017, doi: 10.1109/IROS.2017.8202133.</w:t>
       </w:r>
     </w:p>
     <w:p>
@@ -20380,7 +20380,7 @@
           <w:i w:val="0"/>
           <w:sz w:val="16"/>
         </w:rPr>
-        <w:t xml:space="preserve">A. Biswas and A. Emadi, “Energy management systems for electrified powertrains: State-of-the-art review and future trends,” </w:t>
+        <w:t xml:space="preserve">W. Zhao, J. P. Queralta, and T. Westerlund, “Sim-to-real transfer in deep reinforcement learning for robotics: a survey,” </w:t>
       </w:r>
       <w:r>
         <w:rPr>
@@ -20389,7 +20389,7 @@
           <w:i/>
           <w:sz w:val="16"/>
         </w:rPr>
-        <w:t>IEEE Transactions on Vehicular Technology</w:t>
+        <w:t>Proceedings of the IEEE Symposium Series on Computational Intelligence (SSCI)</w:t>
       </w:r>
       <w:r>
         <w:rPr>
@@ -20398,7 +20398,7 @@
           <w:i w:val="0"/>
           <w:sz w:val="16"/>
         </w:rPr>
-        <w:t>, vol. 68, no. 7, pp. 6453–6467, July 2019, doi: 10.1109/TVT.2019.2914457.</w:t>
+        <w:t>, pp. 737–744, December 2020, doi: 10.1109/SSCI47803.2020.9308468.</w:t>
       </w:r>
     </w:p>
     <w:p>
@@ -20427,7 +20427,7 @@
           <w:i w:val="0"/>
           <w:sz w:val="16"/>
         </w:rPr>
-        <w:t xml:space="preserve">R. David et al., “TensorFlow Lite Micro: Embedded machine learning for TinyML systems,” </w:t>
+        <w:t xml:space="preserve">A. Biswas and A. Emadi, “Energy management systems for electrified powertrains: State-of-the-art review and future trends,” </w:t>
       </w:r>
       <w:r>
         <w:rPr>
@@ -20436,7 +20436,7 @@
           <w:i/>
           <w:sz w:val="16"/>
         </w:rPr>
-        <w:t>Proceedings of Machine Learning and Systems (MLSys)</w:t>
+        <w:t>IEEE Transactions on Vehicular Technology</w:t>
       </w:r>
       <w:r>
         <w:rPr>
@@ -20445,7 +20445,7 @@
           <w:i w:val="0"/>
           <w:sz w:val="16"/>
         </w:rPr>
-        <w:t>, vol. 3, 2021.</w:t>
+        <w:t>, vol. 68, no. 7, pp. 6453–6467, July 2019, doi: 10.1109/TVT.2019.2914457.</w:t>
       </w:r>
     </w:p>
     <w:p>
@@ -20474,7 +20474,7 @@
           <w:i w:val="0"/>
           <w:sz w:val="16"/>
         </w:rPr>
-        <w:t xml:space="preserve">J. Lin, W.-M. Chen, Y. Lin, J. Cohn, C. Gan, and S. Han, “MCUNet: Tiny deep learning on IoT devices,” </w:t>
+        <w:t xml:space="preserve">R. David et al., “TensorFlow Lite Micro: Embedded machine learning for TinyML systems,” </w:t>
       </w:r>
       <w:r>
         <w:rPr>
@@ -20483,7 +20483,7 @@
           <w:i/>
           <w:sz w:val="16"/>
         </w:rPr>
-        <w:t>Advances in Neural Information Processing Systems 33</w:t>
+        <w:t>Proceedings of Machine Learning and Systems (MLSys)</w:t>
       </w:r>
       <w:r>
         <w:rPr>
@@ -20492,7 +20492,7 @@
           <w:i w:val="0"/>
           <w:sz w:val="16"/>
         </w:rPr>
-        <w:t>, vol. 33, 2020.</w:t>
+        <w:t>, vol. 3, 2021.</w:t>
       </w:r>
     </w:p>
     <w:p>
@@ -20521,7 +20521,7 @@
           <w:i w:val="0"/>
           <w:sz w:val="16"/>
         </w:rPr>
-        <w:t xml:space="preserve">B. Jacob et al., “Quantization and training of neural networks for efficient integer-arithmetic-only inference,” </w:t>
+        <w:t xml:space="preserve">J. Lin, W.-M. Chen, Y. Lin, J. Cohn, C. Gan, and S. Han, “MCUNet: Tiny deep learning on IoT devices,” </w:t>
       </w:r>
       <w:r>
         <w:rPr>
@@ -20530,7 +20530,7 @@
           <w:i/>
           <w:sz w:val="16"/>
         </w:rPr>
-        <w:t>Proceedings of the IEEE/CVF Conference on Computer Vision and Pattern Recognition (CVPR)</w:t>
+        <w:t>Advances in Neural Information Processing Systems 33</w:t>
       </w:r>
       <w:r>
         <w:rPr>
@@ -20539,7 +20539,7 @@
           <w:i w:val="0"/>
           <w:sz w:val="16"/>
         </w:rPr>
-        <w:t>, pp. 2704–2713, June 2018, doi: 10.1109/CVPR.2018.00286.</w:t>
+        <w:t>, vol. 33, 2020.</w:t>
       </w:r>
     </w:p>
     <w:p>
@@ -20568,7 +20568,7 @@
           <w:i w:val="0"/>
           <w:sz w:val="16"/>
         </w:rPr>
-        <w:t xml:space="preserve">G. Hinton, O. Vinyals, and J. Dean, “Distilling the knowledge in a neural network,” </w:t>
+        <w:t xml:space="preserve">B. Jacob et al., “Quantization and training of neural networks for efficient integer-arithmetic-only inference,” </w:t>
       </w:r>
       <w:r>
         <w:rPr>
@@ -20577,7 +20577,7 @@
           <w:i/>
           <w:sz w:val="16"/>
         </w:rPr>
-        <w:t>arXiv preprint arXiv:1503.02531 (NIPS 2014 Deep Learning and Representation Learning Workshop)</w:t>
+        <w:t>Proceedings of the IEEE/CVF Conference on Computer Vision and Pattern Recognition (CVPR)</w:t>
       </w:r>
       <w:r>
         <w:rPr>
@@ -20586,7 +20586,7 @@
           <w:i w:val="0"/>
           <w:sz w:val="16"/>
         </w:rPr>
-        <w:t>, March 2015, doi: 10.48550/arXiv.1503.02531.</w:t>
+        <w:t>, pp. 2704–2713, June 2018, doi: 10.1109/CVPR.2018.00286.</w:t>
       </w:r>
     </w:p>
     <w:p>
@@ -20615,7 +20615,7 @@
           <w:i w:val="0"/>
           <w:sz w:val="16"/>
         </w:rPr>
-        <w:t xml:space="preserve">D. Seo and J. Kang, “Dynamic-model-free vehicle velocity estimation using extended Kalman filter with IMU, steering angle, and wheel speed sensors,” </w:t>
+        <w:t xml:space="preserve">G. Hinton, O. Vinyals, and J. Dean, “Distilling the knowledge in a neural network,” </w:t>
       </w:r>
       <w:r>
         <w:rPr>
@@ -20624,7 +20624,7 @@
           <w:i/>
           <w:sz w:val="16"/>
         </w:rPr>
-        <w:t>Measurement</w:t>
+        <w:t>arXiv preprint arXiv:1503.02531 (NIPS 2014 Deep Learning and Representation Learning Workshop)</w:t>
       </w:r>
       <w:r>
         <w:rPr>
@@ -20633,7 +20633,7 @@
           <w:i w:val="0"/>
           <w:sz w:val="16"/>
         </w:rPr>
-        <w:t>, vol. 242, pp. 115810, January 2025, doi: 10.1016/j.measurement.2024.115810.</w:t>
+        <w:t>, March 2015, doi: 10.48550/arXiv.1503.02531.</w:t>
       </w:r>
     </w:p>
     <w:p>
@@ -20662,7 +20662,7 @@
           <w:i w:val="0"/>
           <w:sz w:val="16"/>
         </w:rPr>
-        <w:t xml:space="preserve">R. Isermann, “Model-based fault-detection and diagnosis: Status and applications,” </w:t>
+        <w:t xml:space="preserve">D. Seo and J. Kang, “Dynamic-model-free vehicle velocity estimation using extended Kalman filter with IMU, steering angle, and wheel speed sensors,” </w:t>
       </w:r>
       <w:r>
         <w:rPr>
@@ -20671,7 +20671,7 @@
           <w:i/>
           <w:sz w:val="16"/>
         </w:rPr>
-        <w:t>Annual Reviews in Control</w:t>
+        <w:t>Measurement</w:t>
       </w:r>
       <w:r>
         <w:rPr>
@@ -20680,7 +20680,7 @@
           <w:i w:val="0"/>
           <w:sz w:val="16"/>
         </w:rPr>
-        <w:t>, vol. 29, no. 1, pp. 71–85, 2005, doi: 10.1016/j.arcontrol.2004.12.002.</w:t>
+        <w:t>, vol. 242, pp. 115810, January 2025, doi: 10.1016/j.measurement.2024.115810.</w:t>
       </w:r>
     </w:p>
     <w:p>
@@ -20709,7 +20709,7 @@
           <w:i w:val="0"/>
           <w:sz w:val="16"/>
         </w:rPr>
-        <w:t xml:space="preserve">P. Malhotra, L. Vig, G. Shroff, and P. Agarwal, “Long short term memory networks for anomaly detection in time series,” </w:t>
+        <w:t xml:space="preserve">R. Isermann, “Model-based fault-detection and diagnosis: Status and applications,” </w:t>
       </w:r>
       <w:r>
         <w:rPr>
@@ -20718,7 +20718,7 @@
           <w:i/>
           <w:sz w:val="16"/>
         </w:rPr>
-        <w:t>Proceedings of the European Symposium on Artificial Neural Networks (ESANN)</w:t>
+        <w:t>Annual Reviews in Control</w:t>
       </w:r>
       <w:r>
         <w:rPr>
@@ -20727,7 +20727,7 @@
           <w:i w:val="0"/>
           <w:sz w:val="16"/>
         </w:rPr>
-        <w:t>, pp. 89–94, April 2015.</w:t>
+        <w:t>, vol. 29, no. 1, pp. 71–85, 2005, doi: 10.1016/j.arcontrol.2004.12.002.</w:t>
       </w:r>
     </w:p>
     <w:p>
@@ -20756,7 +20756,7 @@
           <w:i w:val="0"/>
           <w:sz w:val="16"/>
         </w:rPr>
-        <w:t xml:space="preserve">V. Chandola, A. Banerjee, and V. Kumar, “Anomaly detection: A survey,” </w:t>
+        <w:t xml:space="preserve">P. Malhotra, L. Vig, G. Shroff, and P. Agarwal, “Long short term memory networks for anomaly detection in time series,” </w:t>
       </w:r>
       <w:r>
         <w:rPr>
@@ -20765,7 +20765,7 @@
           <w:i/>
           <w:sz w:val="16"/>
         </w:rPr>
-        <w:t>ACM Computing Surveys</w:t>
+        <w:t>Proceedings of the European Symposium on Artificial Neural Networks (ESANN)</w:t>
       </w:r>
       <w:r>
         <w:rPr>
@@ -20774,7 +20774,7 @@
           <w:i w:val="0"/>
           <w:sz w:val="16"/>
         </w:rPr>
-        <w:t>, vol. 41, no. 3, pp. 1–58, July 2009, doi: 10.1145/1541880.1541882.</w:t>
+        <w:t>, pp. 89–94, April 2015.</w:t>
       </w:r>
     </w:p>
     <w:p>
@@ -20803,7 +20803,7 @@
           <w:i w:val="0"/>
           <w:sz w:val="16"/>
         </w:rPr>
-        <w:t xml:space="preserve">K. Cho et al., “Learning phrase representations using RNN encoder-decoder for statistical machine translation,” </w:t>
+        <w:t xml:space="preserve">V. Chandola, A. Banerjee, and V. Kumar, “Anomaly detection: A survey,” </w:t>
       </w:r>
       <w:r>
         <w:rPr>
@@ -20812,7 +20812,7 @@
           <w:i/>
           <w:sz w:val="16"/>
         </w:rPr>
-        <w:t>Proceedings of the 2014 Conference on Empirical Methods in Natural Language Processing (EMNLP)</w:t>
+        <w:t>ACM Computing Surveys</w:t>
       </w:r>
       <w:r>
         <w:rPr>
@@ -20821,7 +20821,7 @@
           <w:i w:val="0"/>
           <w:sz w:val="16"/>
         </w:rPr>
-        <w:t>, pp. 1724–1734, 2014, doi: 10.3115/v1/D14-1179.</w:t>
+        <w:t>, vol. 41, no. 3, pp. 1–58, July 2009, doi: 10.1145/1541880.1541882.</w:t>
       </w:r>
     </w:p>
     <w:p>
@@ -20850,7 +20850,7 @@
           <w:i w:val="0"/>
           <w:sz w:val="16"/>
         </w:rPr>
-        <w:t xml:space="preserve">A. Kusupati, M. Singh, K. Bhatia, A. Kumar, P. Jain, and M. Varma, “FastGRNN: A fast, accurate, stable and tiny kilobyte sized gated recurrent neural network,” </w:t>
+        <w:t xml:space="preserve">K. Cho et al., “Learning phrase representations using RNN encoder-decoder for statistical machine translation,” </w:t>
       </w:r>
       <w:r>
         <w:rPr>
@@ -20859,7 +20859,7 @@
           <w:i/>
           <w:sz w:val="16"/>
         </w:rPr>
-        <w:t>Advances in Neural Information Processing Systems 31</w:t>
+        <w:t>Proceedings of the 2014 Conference on Empirical Methods in Natural Language Processing (EMNLP)</w:t>
       </w:r>
       <w:r>
         <w:rPr>
@@ -20868,7 +20868,7 @@
           <w:i w:val="0"/>
           <w:sz w:val="16"/>
         </w:rPr>
-        <w:t>, vol. 31, 2018.</w:t>
+        <w:t>, pp. 1724–1734, 2014, doi: 10.3115/v1/D14-1179.</w:t>
       </w:r>
     </w:p>
     <w:p>
@@ -20897,7 +20897,7 @@
           <w:i w:val="0"/>
           <w:sz w:val="16"/>
         </w:rPr>
-        <w:t xml:space="preserve">Idaho National Laboratory and Intertek, “2013 Nissan Leaf, advanced vehicle testing, baseline testing results,” </w:t>
+        <w:t xml:space="preserve">A. Kusupati, M. Singh, K. Bhatia, A. Kumar, P. Jain, and M. Varma, “FastGRNN: A fast, accurate, stable and tiny kilobyte sized gated recurrent neural network,” </w:t>
       </w:r>
       <w:r>
         <w:rPr>
@@ -20906,7 +20906,7 @@
           <w:i/>
           <w:sz w:val="16"/>
         </w:rPr>
-        <w:t>U.S. Department of Energy, Vehicle Technologies Program (technical report)</w:t>
+        <w:t>Advances in Neural Information Processing Systems 31</w:t>
       </w:r>
       <w:r>
         <w:rPr>
@@ -20915,7 +20915,7 @@
           <w:i w:val="0"/>
           <w:sz w:val="16"/>
         </w:rPr>
-        <w:t>.</w:t>
+        <w:t>, vol. 31, 2018.</w:t>
       </w:r>
     </w:p>
     <w:p>
@@ -20935,6 +20935,53 @@
           <w:sz w:val="16"/>
         </w:rPr>
         <w:t>[43]</w:t>
+        <w:tab/>
+      </w:r>
+      <w:r>
+        <w:rPr>
+          <w:rFonts w:ascii="Times New Roman" w:hAnsi="Times New Roman" w:eastAsia="Times New Roman"/>
+          <w:b w:val="0"/>
+          <w:i w:val="0"/>
+          <w:sz w:val="16"/>
+        </w:rPr>
+        <w:t xml:space="preserve">Idaho National Laboratory and Intertek, “2013 Nissan Leaf, advanced vehicle testing, baseline testing results,” </w:t>
+      </w:r>
+      <w:r>
+        <w:rPr>
+          <w:rFonts w:ascii="Times New Roman" w:hAnsi="Times New Roman" w:eastAsia="Times New Roman"/>
+          <w:b w:val="0"/>
+          <w:i/>
+          <w:sz w:val="16"/>
+        </w:rPr>
+        <w:t>U.S. Department of Energy, Vehicle Technologies Program (technical report)</w:t>
+      </w:r>
+      <w:r>
+        <w:rPr>
+          <w:rFonts w:ascii="Times New Roman" w:hAnsi="Times New Roman" w:eastAsia="Times New Roman"/>
+          <w:b w:val="0"/>
+          <w:i w:val="0"/>
+          <w:sz w:val="16"/>
+        </w:rPr>
+        <w:t>.</w:t>
+      </w:r>
+    </w:p>
+    <w:p>
+      <w:pPr>
+        <w:tabs>
+          <w:tab w:pos="403" w:val="left"/>
+        </w:tabs>
+        <w:spacing w:before="0" w:after="20"/>
+        <w:ind w:left="403" w:hanging="403"/>
+        <w:jc w:val="both"/>
+      </w:pPr>
+      <w:r>
+        <w:rPr>
+          <w:rFonts w:ascii="Times New Roman" w:hAnsi="Times New Roman" w:eastAsia="Times New Roman"/>
+          <w:b w:val="0"/>
+          <w:i w:val="0"/>
+          <w:sz w:val="16"/>
+        </w:rPr>
+        <w:t>[44]</w:t>
         <w:tab/>
       </w:r>
       <w:r>

</xml_diff>

<commit_message>
Name Swathi Tangi as co-author and corresponding author
The author edits made by hand in the Word draft on 25 Oct now live in
00-front.json, so a rebuild keeps them: Swathi Tangi as second author,
Dr Swathi Tangi as corresponding author, and the biography placeholder
"Biography to be written." (spelling fixed from the Word edit).

Rebuilt with paper/build_paper.py: 44 references cited, and the text
differs from master only in those three lines. The PDF is not
re-rendered here, because render_check.sh needs Word on the Mac.

Co-Authored-By: Claude Opus 5.5 (1M context) <noreply@anthropic.com>
Claude-Session: https://claude.ai/code/session_01V2XJUwf4EjaTjuyF5AD76K
</commit_message>
<xml_diff>
--- a/paper/EV-PIL-mock-paper-IEEE-Access.docx
+++ b/paper/EV-PIL-mock-paper-IEEE-Access.docx
@@ -83,7 +83,7 @@
           <w:i w:val="0"/>
           <w:sz w:val="21"/>
         </w:rPr>
-        <w:t>[CO-AUTHOR NAMES TO BE CONFIRMED]</w:t>
+        <w:t>SWATHI TANGI</w:t>
       </w:r>
       <w:r>
         <w:rPr>
@@ -121,7 +121,7 @@
           <w:i w:val="0"/>
           <w:sz w:val="15"/>
         </w:rPr>
-        <w:t>Corresponding author: Manikanta Gonugondla (e-mail to be confirmed).</w:t>
+        <w:t>Corresponding author: Dr Swathi Tangi</w:t>
       </w:r>
     </w:p>
     <w:p>
@@ -5843,7 +5843,7 @@
       <w:r>
         <w:drawing>
           <wp:inline xmlns:a="http://schemas.openxmlformats.org/drawingml/2006/main" xmlns:pic="http://schemas.openxmlformats.org/drawingml/2006/picture">
-            <wp:extent cx="2436876" cy="185928"/>
+            <wp:extent cx="2514600" cy="172212"/>
             <wp:docPr id="3" name="Picture 3"/>
             <wp:cNvGraphicFramePr>
               <a:graphicFrameLocks noChangeAspect="1"/>
@@ -5864,7 +5864,7 @@
                   <pic:spPr>
                     <a:xfrm>
                       <a:off x="0" y="0"/>
-                      <a:ext cx="2436876" cy="185928"/>
+                      <a:ext cx="2514600" cy="172212"/>
                     </a:xfrm>
                     <a:prstGeom prst="rect"/>
                   </pic:spPr>
@@ -5963,7 +5963,7 @@
       <w:r>
         <w:drawing>
           <wp:inline xmlns:a="http://schemas.openxmlformats.org/drawingml/2006/main" xmlns:pic="http://schemas.openxmlformats.org/drawingml/2006/picture">
-            <wp:extent cx="2788920" cy="139144"/>
+            <wp:extent cx="2788920" cy="133677"/>
             <wp:docPr id="4" name="Picture 4"/>
             <wp:cNvGraphicFramePr>
               <a:graphicFrameLocks noChangeAspect="1"/>
@@ -5984,7 +5984,7 @@
                   <pic:spPr>
                     <a:xfrm>
                       <a:off x="0" y="0"/>
-                      <a:ext cx="2788920" cy="139144"/>
+                      <a:ext cx="2788920" cy="133677"/>
                     </a:xfrm>
                     <a:prstGeom prst="rect"/>
                   </pic:spPr>
@@ -6127,7 +6127,7 @@
       <w:r>
         <w:drawing>
           <wp:inline xmlns:a="http://schemas.openxmlformats.org/drawingml/2006/main" xmlns:pic="http://schemas.openxmlformats.org/drawingml/2006/picture">
-            <wp:extent cx="269748" cy="140208"/>
+            <wp:extent cx="281940" cy="144780"/>
             <wp:docPr id="5" name="Picture 5"/>
             <wp:cNvGraphicFramePr>
               <a:graphicFrameLocks noChangeAspect="1"/>
@@ -6148,7 +6148,7 @@
                   <pic:spPr>
                     <a:xfrm>
                       <a:off x="0" y="0"/>
-                      <a:ext cx="269748" cy="140208"/>
+                      <a:ext cx="281940" cy="144780"/>
                     </a:xfrm>
                     <a:prstGeom prst="rect"/>
                   </pic:spPr>
@@ -6182,7 +6182,7 @@
       <w:r>
         <w:drawing>
           <wp:inline xmlns:a="http://schemas.openxmlformats.org/drawingml/2006/main" xmlns:pic="http://schemas.openxmlformats.org/drawingml/2006/picture">
-            <wp:extent cx="2758440" cy="196596"/>
+            <wp:extent cx="2788920" cy="164717"/>
             <wp:docPr id="6" name="Picture 6"/>
             <wp:cNvGraphicFramePr>
               <a:graphicFrameLocks noChangeAspect="1"/>
@@ -6203,7 +6203,7 @@
                   <pic:spPr>
                     <a:xfrm>
                       <a:off x="0" y="0"/>
-                      <a:ext cx="2758440" cy="196596"/>
+                      <a:ext cx="2788920" cy="164717"/>
                     </a:xfrm>
                     <a:prstGeom prst="rect"/>
                   </pic:spPr>
@@ -7455,7 +7455,7 @@
       <w:r>
         <w:drawing>
           <wp:inline xmlns:a="http://schemas.openxmlformats.org/drawingml/2006/main" xmlns:pic="http://schemas.openxmlformats.org/drawingml/2006/picture">
-            <wp:extent cx="1961388" cy="146304"/>
+            <wp:extent cx="2103120" cy="152400"/>
             <wp:docPr id="9" name="Picture 9"/>
             <wp:cNvGraphicFramePr>
               <a:graphicFrameLocks noChangeAspect="1"/>
@@ -7476,7 +7476,7 @@
                   <pic:spPr>
                     <a:xfrm>
                       <a:off x="0" y="0"/>
-                      <a:ext cx="1961388" cy="146304"/>
+                      <a:ext cx="2103120" cy="152400"/>
                     </a:xfrm>
                     <a:prstGeom prst="rect"/>
                   </pic:spPr>
@@ -8496,7 +8496,7 @@
       <w:r>
         <w:drawing>
           <wp:inline xmlns:a="http://schemas.openxmlformats.org/drawingml/2006/main" xmlns:pic="http://schemas.openxmlformats.org/drawingml/2006/picture">
-            <wp:extent cx="358140" cy="140208"/>
+            <wp:extent cx="374904" cy="144780"/>
             <wp:docPr id="11" name="Picture 11"/>
             <wp:cNvGraphicFramePr>
               <a:graphicFrameLocks noChangeAspect="1"/>
@@ -8517,7 +8517,7 @@
                   <pic:spPr>
                     <a:xfrm>
                       <a:off x="0" y="0"/>
-                      <a:ext cx="358140" cy="140208"/>
+                      <a:ext cx="374904" cy="144780"/>
                     </a:xfrm>
                     <a:prstGeom prst="rect"/>
                   </pic:spPr>
@@ -14118,7 +14118,7 @@
       <w:r>
         <w:drawing>
           <wp:inline xmlns:a="http://schemas.openxmlformats.org/drawingml/2006/main" xmlns:pic="http://schemas.openxmlformats.org/drawingml/2006/picture">
-            <wp:extent cx="454152" cy="140208"/>
+            <wp:extent cx="455676" cy="144780"/>
             <wp:docPr id="14" name="Picture 14"/>
             <wp:cNvGraphicFramePr>
               <a:graphicFrameLocks noChangeAspect="1"/>
@@ -14139,7 +14139,7 @@
                   <pic:spPr>
                     <a:xfrm>
                       <a:off x="0" y="0"/>
-                      <a:ext cx="454152" cy="140208"/>
+                      <a:ext cx="455676" cy="144780"/>
                     </a:xfrm>
                     <a:prstGeom prst="rect"/>
                   </pic:spPr>
@@ -15392,7 +15392,7 @@
       <w:r>
         <w:drawing>
           <wp:inline xmlns:a="http://schemas.openxmlformats.org/drawingml/2006/main" xmlns:pic="http://schemas.openxmlformats.org/drawingml/2006/picture">
-            <wp:extent cx="2631948" cy="184404"/>
+            <wp:extent cx="2788920" cy="181332"/>
             <wp:docPr id="16" name="Picture 16"/>
             <wp:cNvGraphicFramePr>
               <a:graphicFrameLocks noChangeAspect="1"/>
@@ -15413,7 +15413,7 @@
                   <pic:spPr>
                     <a:xfrm>
                       <a:off x="0" y="0"/>
-                      <a:ext cx="2631948" cy="184404"/>
+                      <a:ext cx="2788920" cy="181332"/>
                     </a:xfrm>
                     <a:prstGeom prst="rect"/>
                   </pic:spPr>
@@ -15508,7 +15508,7 @@
       <w:r>
         <w:drawing>
           <wp:inline xmlns:a="http://schemas.openxmlformats.org/drawingml/2006/main" xmlns:pic="http://schemas.openxmlformats.org/drawingml/2006/picture">
-            <wp:extent cx="149352" cy="140208"/>
+            <wp:extent cx="146304" cy="144780"/>
             <wp:docPr id="17" name="Picture 17"/>
             <wp:cNvGraphicFramePr>
               <a:graphicFrameLocks noChangeAspect="1"/>
@@ -15529,7 +15529,7 @@
                   <pic:spPr>
                     <a:xfrm>
                       <a:off x="0" y="0"/>
-                      <a:ext cx="149352" cy="140208"/>
+                      <a:ext cx="146304" cy="144780"/>
                     </a:xfrm>
                     <a:prstGeom prst="rect"/>
                   </pic:spPr>
@@ -15675,7 +15675,7 @@
       <w:r>
         <w:drawing>
           <wp:inline xmlns:a="http://schemas.openxmlformats.org/drawingml/2006/main" xmlns:pic="http://schemas.openxmlformats.org/drawingml/2006/picture">
-            <wp:extent cx="2788920" cy="197433"/>
+            <wp:extent cx="2788920" cy="171586"/>
             <wp:docPr id="18" name="Picture 18"/>
             <wp:cNvGraphicFramePr>
               <a:graphicFrameLocks noChangeAspect="1"/>
@@ -15696,7 +15696,7 @@
                   <pic:spPr>
                     <a:xfrm>
                       <a:off x="0" y="0"/>
-                      <a:ext cx="2788920" cy="197433"/>
+                      <a:ext cx="2788920" cy="171586"/>
                     </a:xfrm>
                     <a:prstGeom prst="rect"/>
                   </pic:spPr>
@@ -16598,7 +16598,7 @@
       <w:r>
         <w:drawing>
           <wp:inline xmlns:a="http://schemas.openxmlformats.org/drawingml/2006/main" xmlns:pic="http://schemas.openxmlformats.org/drawingml/2006/picture">
-            <wp:extent cx="80772" cy="140208"/>
+            <wp:extent cx="82296" cy="144780"/>
             <wp:docPr id="20" name="Picture 20"/>
             <wp:cNvGraphicFramePr>
               <a:graphicFrameLocks noChangeAspect="1"/>
@@ -16619,7 +16619,7 @@
                   <pic:spPr>
                     <a:xfrm>
                       <a:off x="0" y="0"/>
-                      <a:ext cx="80772" cy="140208"/>
+                      <a:ext cx="82296" cy="144780"/>
                     </a:xfrm>
                     <a:prstGeom prst="rect"/>
                   </pic:spPr>
@@ -16681,7 +16681,7 @@
       <w:r>
         <w:drawing>
           <wp:inline xmlns:a="http://schemas.openxmlformats.org/drawingml/2006/main" xmlns:pic="http://schemas.openxmlformats.org/drawingml/2006/picture">
-            <wp:extent cx="1807464" cy="265176"/>
+            <wp:extent cx="1844040" cy="246888"/>
             <wp:docPr id="21" name="Picture 21"/>
             <wp:cNvGraphicFramePr>
               <a:graphicFrameLocks noChangeAspect="1"/>
@@ -16702,7 +16702,7 @@
                   <pic:spPr>
                     <a:xfrm>
                       <a:off x="0" y="0"/>
-                      <a:ext cx="1807464" cy="265176"/>
+                      <a:ext cx="1844040" cy="246888"/>
                     </a:xfrm>
                     <a:prstGeom prst="rect"/>
                   </pic:spPr>
@@ -21033,7 +21033,7 @@
           <w:i w:val="0"/>
           <w:sz w:val="16"/>
         </w:rPr>
-        <w:t>[Biography and photograph to be supplied.]</w:t>
+        <w:t>Biography to be written.</w:t>
       </w:r>
     </w:p>
     <w:sectPr>

</xml_diff>